<commit_message>
v2.3.1: alineación integral con U-40
- Duraciones del texto calculadas en el build con el modelo anclado a U-40
  (marcas DUR) en lugar de escritas a mano.
- Sprints definidos como secuencia (~3 días hábiles) para caber en 13 semanas;
  SME 1-13 semanales. D1 deja de figurar como la fase de mayor esfuerzo.
- README con 541 requisitos y 40 umbrales; el build valida conteos y versión
  de README y CITATION.cff.
- verificar.py y el documento metodológico evalúan U-40; etiquetas ágil/completo.
- El estándar de agentes cita la meta de 15 días hábiles.

Co-Authored-By: Claude Opus 5.5 <noreply@anthropic.com>
</commit_message>
<xml_diff>
--- a/ejemplos/documento-metodologico/MOD-EJEMPLO-001_documento-metodologico_v1.0.docx
+++ b/ejemplos/documento-metodologico/MOD-EJEMPLO-001_documento-metodologico_v1.0.docx
@@ -182,7 +182,7 @@
               <w:pStyle w:val="Compact"/>
             </w:pPr>
             <w:r>
-              <w:t xml:space="preserve">Desarrollo · Tier II · Machine learning · enfoque agil</w:t>
+              <w:t xml:space="preserve">Desarrollo · Tier II · Machine learning · enfoque ágil</w:t>
             </w:r>
           </w:p>
         </w:tc>
@@ -254,7 +254,7 @@
               <w:pStyle w:val="Compact"/>
             </w:pPr>
             <w:r>
-              <w:t xml:space="preserve">Estándares de Modelos en Banca v2.2.0</w:t>
+              <w:t xml:space="preserve">Estándares de Modelos en Banca v2.3.1</w:t>
             </w:r>
           </w:p>
         </w:tc>
@@ -3918,6 +3918,68 @@
           </w:p>
         </w:tc>
       </w:tr>
+      <w:tr>
+        <w:tc>
+          <w:tcPr/>
+          <w:p>
+            <w:pPr>
+              <w:pStyle w:val="Compact"/>
+            </w:pPr>
+            <w:r>
+              <w:t xml:space="preserve">U-40</w:t>
+            </w:r>
+          </w:p>
+        </w:tc>
+        <w:tc>
+          <w:tcPr/>
+          <w:p>
+            <w:pPr>
+              <w:pStyle w:val="Compact"/>
+            </w:pPr>
+            <w:r>
+              <w:t xml:space="preserve">Plazo máximo de desarrollo de un modelo</w:t>
+            </w:r>
+          </w:p>
+        </w:tc>
+        <w:tc>
+          <w:tcPr/>
+          <w:p>
+            <w:pPr>
+              <w:pStyle w:val="Compact"/>
+              <w:jc w:val="right"/>
+            </w:pPr>
+            <w:r>
+              <w:t xml:space="preserve">11</w:t>
+            </w:r>
+          </w:p>
+        </w:tc>
+        <w:tc>
+          <w:tcPr/>
+          <w:p>
+            <w:pPr>
+              <w:pStyle w:val="Compact"/>
+            </w:pPr>
+            <w:r>
+              <w:t xml:space="preserve">Duración del desarrollo con 2 personas ≤ 13 semanas (con agentes de IA ≤ 15 días hábiles)</w:t>
+            </w:r>
+          </w:p>
+        </w:tc>
+        <w:tc>
+          <w:tcPr/>
+          <w:p>
+            <w:pPr>
+              <w:pStyle w:val="Compact"/>
+            </w:pPr>
+            <w:r>
+              <w:rPr>
+                <w:b/>
+                <w:bCs/>
+              </w:rPr>
+              <w:t xml:space="preserve">Cumple</w:t>
+            </w:r>
+          </w:p>
+        </w:tc>
+      </w:tr>
     </w:tbl>
     <w:bookmarkEnd w:id="33"/>
     <w:bookmarkStart w:id="34" w:name="matriz-de-requisitos"/>
@@ -3934,7 +3996,7 @@
         <w:pStyle w:val="FirstParagraph"/>
       </w:pPr>
       <w:r>
-        <w:t xml:space="preserve">Requisitos aplicables a un modelo Desarrollo Tier II, Machine learning, enfoque agil. Sin manifiesto de evidencias: todos figuran como pendientes (ver</w:t>
+        <w:t xml:space="preserve">Requisitos aplicables a un modelo Desarrollo Tier II, Machine learning, enfoque ágil. Sin manifiesto de evidencias: todos figuran como pendientes (ver</w:t>
       </w:r>
       <w:r>
         <w:t xml:space="preserve"> </w:t>

</xml_diff>

<commit_message>
v2.4.0: OOT = último mes con desempeño completo (U-01)
- U-01: Train/Test con mínimo 12 meses; el OOT es solo la cosecha más
  reciente que ya cumple los 12 meses de desempeño, sin acumular meses.
- Alineados DES-D1-03.01.02, acta de ventana, D1, glosario, ficha,
  MODEL_CARD y documento metodológico (evaluación, plantilla, gráfico y
  ejemplo).

Co-Authored-By: Claude Opus 5.5 <noreply@anthropic.com>
</commit_message>
<xml_diff>
--- a/ejemplos/documento-metodologico/MOD-EJEMPLO-001_documento-metodologico_v1.0.docx
+++ b/ejemplos/documento-metodologico/MOD-EJEMPLO-001_documento-metodologico_v1.0.docx
@@ -254,7 +254,7 @@
               <w:pStyle w:val="Compact"/>
             </w:pPr>
             <w:r>
-              <w:t xml:space="preserve">Estándares de Modelos en Banca v2.3.1</w:t>
+              <w:t xml:space="preserve">Estándares de Modelos en Banca v2.4.0</w:t>
             </w:r>
           </w:p>
         </w:tc>
@@ -402,7 +402,7 @@
         <w:pStyle w:val="FirstParagraph"/>
       </w:pPr>
       <w:r>
-        <w:t xml:space="preserve">El modelo es un gradient boosting con restricciones monotónicas sobre 24 variables de buró, de relación con el banco y de la solicitud. Alcanza un Gini OOT de 52.1 (54.0 en entrenamiento; diferencia de 1.9 pts) y supera en 6.4 pts al modelo vigente en las cosechas aprobadas de los últimos seis meses. Su uso propuesto reduce en 0.8 pp la mora a 12 meses de la cosecha manteniendo el volumen de aprobación.</w:t>
+        <w:t xml:space="preserve">El modelo es un gradient boosting con restricciones monotónicas sobre 24 variables de buró, de relación con el banco y de la solicitud. Alcanza un Gini OOT de 52.1 (54.0 en entrenamiento; diferencia de 1.9 pts) y supera en 6.4 pts al modelo vigente en el mes OOT, la última cosecha con desempeño completo. Su uso propuesto reduce en 0.8 pp la mora a 12 meses de la cosecha manteniendo el volumen de aprobación.</w:t>
       </w:r>
     </w:p>
     <w:bookmarkEnd w:id="10"/>
@@ -806,19 +806,20 @@
         <w:t xml:space="preserve"> </w:t>
       </w:r>
       <w:r>
-        <w:t xml:space="preserve">Solicitudes aprobadas de tarjeta de crédito de personas naturales, enero 2023 a diciembre 2024.</w:t>
+        <w:t xml:space="preserve">Solicitudes aprobadas de tarjeta de crédito de personas naturales, enero 2023 a julio 2024.</w:t>
       </w:r>
     </w:p>
     <w:tbl>
       <w:tblPr>
         <w:tblStyle w:val="Table"/>
-        <w:tblW w:type="auto" w:w="0"/>
+        <w:tblW w:type="pct" w:w="5000"/>
+        <w:tblLayout w:type="fixed"/>
         <w:tblLook w:firstRow="1" w:lastRow="0" w:firstColumn="0" w:lastColumn="0" w:noHBand="0" w:noVBand="0" w:val="0020"/>
       </w:tblPr>
       <w:tblGrid>
-        <w:gridCol w:w="2640"/>
-        <w:gridCol w:w="2640"/>
-        <w:gridCol w:w="2640"/>
+        <w:gridCol w:w="2376"/>
+        <w:gridCol w:w="2376"/>
+        <w:gridCol w:w="3168"/>
       </w:tblGrid>
       <w:tr>
         <w:trPr>
@@ -914,19 +915,19 @@
               <w:pStyle w:val="Compact"/>
             </w:pPr>
             <w:r>
-              <w:t xml:space="preserve">julio a diciembre 2024</w:t>
-            </w:r>
-          </w:p>
-        </w:tc>
-        <w:tc>
-          <w:tcPr/>
-          <w:p>
-            <w:pPr>
-              <w:pStyle w:val="Compact"/>
-              <w:jc w:val="right"/>
-            </w:pPr>
-            <w:r>
-              <w:t xml:space="preserve">6</w:t>
+              <w:t xml:space="preserve">julio 2024 (última cosecha con 12 meses de desempeño)</w:t>
+            </w:r>
+          </w:p>
+        </w:tc>
+        <w:tc>
+          <w:tcPr/>
+          <w:p>
+            <w:pPr>
+              <w:pStyle w:val="Compact"/>
+              <w:jc w:val="right"/>
+            </w:pPr>
+            <w:r>
+              <w:t xml:space="preserve">1</w:t>
             </w:r>
           </w:p>
         </w:tc>
@@ -2441,7 +2442,7 @@
               <w:jc w:val="right"/>
             </w:pPr>
             <w:r>
-              <w:t xml:space="preserve">96 450</w:t>
+              <w:t xml:space="preserve">16 080</w:t>
             </w:r>
           </w:p>
         </w:tc>
@@ -2539,7 +2540,7 @@
           <wp:inline>
             <wp:extent cx="5192395" cy="2435480"/>
             <wp:effectExtent b="0" l="0" r="0" t="0"/>
-            <wp:docPr descr="Gini OOT por mes frente al de construcción" title="" id="24" name="Picture"/>
+            <wp:docPr descr="Gini por mes del periodo de construcción y del mes OOT, frente al de entrenamiento" title="" id="24" name="Picture"/>
             <a:graphic>
               <a:graphicData uri="http://schemas.openxmlformats.org/drawingml/2006/picture">
                 <pic:pic>
@@ -2582,7 +2583,7 @@
         <w:pStyle w:val="ImageCaption"/>
       </w:pPr>
       <w:r>
-        <w:t xml:space="preserve">Gini OOT por mes frente al de construcción</w:t>
+        <w:t xml:space="preserve">Gini por mes del periodo de construcción y del mes OOT, frente al de entrenamiento</w:t>
       </w:r>
     </w:p>
     <w:bookmarkEnd w:id="26"/>
@@ -2692,7 +2693,7 @@
               <w:jc w:val="right"/>
             </w:pPr>
             <w:r>
-              <w:t xml:space="preserve">9 640</w:t>
+              <w:t xml:space="preserve">2 680</w:t>
             </w:r>
           </w:p>
         </w:tc>
@@ -2753,7 +2754,7 @@
               <w:jc w:val="right"/>
             </w:pPr>
             <w:r>
-              <w:t xml:space="preserve">9 650</w:t>
+              <w:t xml:space="preserve">2 680</w:t>
             </w:r>
           </w:p>
         </w:tc>
@@ -2814,7 +2815,7 @@
               <w:jc w:val="right"/>
             </w:pPr>
             <w:r>
-              <w:t xml:space="preserve">9 645</w:t>
+              <w:t xml:space="preserve">2 680</w:t>
             </w:r>
           </w:p>
         </w:tc>
@@ -2875,7 +2876,7 @@
               <w:jc w:val="right"/>
             </w:pPr>
             <w:r>
-              <w:t xml:space="preserve">9 640</w:t>
+              <w:t xml:space="preserve">2 680</w:t>
             </w:r>
           </w:p>
         </w:tc>
@@ -2936,7 +2937,7 @@
               <w:jc w:val="right"/>
             </w:pPr>
             <w:r>
-              <w:t xml:space="preserve">9 650</w:t>
+              <w:t xml:space="preserve">2 680</w:t>
             </w:r>
           </w:p>
         </w:tc>
@@ -2997,7 +2998,7 @@
               <w:jc w:val="right"/>
             </w:pPr>
             <w:r>
-              <w:t xml:space="preserve">9 645</w:t>
+              <w:t xml:space="preserve">2 680</w:t>
             </w:r>
           </w:p>
         </w:tc>
@@ -3453,18 +3454,18 @@
               <w:jc w:val="right"/>
             </w:pPr>
             <w:r>
-              <w:t xml:space="preserve">18 + 6</w:t>
-            </w:r>
-          </w:p>
-        </w:tc>
-        <w:tc>
-          <w:tcPr/>
-          <w:p>
-            <w:pPr>
-              <w:pStyle w:val="Compact"/>
-            </w:pPr>
-            <w:r>
-              <w:t xml:space="preserve">≥ 12 meses entrenamiento/prueba y ≥ 6 OOT</w:t>
+              <w:t xml:space="preserve">18 + 1</w:t>
+            </w:r>
+          </w:p>
+        </w:tc>
+        <w:tc>
+          <w:tcPr/>
+          <w:p>
+            <w:pPr>
+              <w:pStyle w:val="Compact"/>
+            </w:pPr>
+            <w:r>
+              <w:t xml:space="preserve">≥ 12 meses entrenamiento/prueba; OOT = último mes con desempeño (1 mes)</w:t>
             </w:r>
           </w:p>
         </w:tc>

</xml_diff>

<commit_message>
v4.0.0: torneo de modelos y lecciones de proyectos de desarrollo
- Nuevo: torneo de al menos cinco familias (U-43), tabla oficial y reglas
  de coronación con parsimonia (U-42), OOT evaluado una sola vez; selección
  de variables en dos fases y bloques estructurales preservados; estabilidad
  de la tasa del target (U-41); desempeño por deciles monótono (U-44) vs.
  calibración formal; punto de corte por utilidad; paridad en producción.
- Cambiado: U-38 filtro asimétrico, U-11 con caída relativa y sin excepción,
  U-09 tope 40 %, U-15 paridad 99.9 %, U-37 caída relativa, U-08 top 100.
- Documento metodológico con tabla del torneo; literatura Brier y Breiman.
- Sin datos de clientes, nombres de variables ni cifras internas.

Co-Authored-By: Claude Opus 5.5 <noreply@anthropic.com>
</commit_message>
<xml_diff>
--- a/ejemplos/documento-metodologico/MOD-EJEMPLO-001_documento-metodologico_v1.0.docx
+++ b/ejemplos/documento-metodologico/MOD-EJEMPLO-001_documento-metodologico_v1.0.docx
@@ -254,7 +254,7 @@
               <w:pStyle w:val="Compact"/>
             </w:pPr>
             <w:r>
-              <w:t xml:space="preserve">Estándares de Modelos en Banca v3.0.0</w:t>
+              <w:t xml:space="preserve">Estándares de Modelos en Banca v4.0.0</w:t>
             </w:r>
           </w:p>
         </w:tc>
@@ -1449,30 +1449,30 @@
               <w:pStyle w:val="Compact"/>
             </w:pPr>
             <w:r>
-              <w:t xml:space="preserve">IV entre 0.02 y 0.50 (U-38)</w:t>
-            </w:r>
-          </w:p>
-        </w:tc>
-        <w:tc>
-          <w:tcPr/>
-          <w:p>
-            <w:pPr>
-              <w:pStyle w:val="Compact"/>
-              <w:jc w:val="right"/>
-            </w:pPr>
-            <w:r>
-              <w:t xml:space="preserve">196</w:t>
-            </w:r>
-          </w:p>
-        </w:tc>
-        <w:tc>
-          <w:tcPr/>
-          <w:p>
-            <w:pPr>
-              <w:pStyle w:val="Compact"/>
-            </w:pPr>
-            <w:r>
-              <w:t xml:space="preserve">120 sin poder predictivo y 2 con sospecha de fuga</w:t>
+              <w:t xml:space="preserve">IV ≤ 0.50 (U-38)</w:t>
+            </w:r>
+          </w:p>
+        </w:tc>
+        <w:tc>
+          <w:tcPr/>
+          <w:p>
+            <w:pPr>
+              <w:pStyle w:val="Compact"/>
+              <w:jc w:val="right"/>
+            </w:pPr>
+            <w:r>
+              <w:t xml:space="preserve">316</w:t>
+            </w:r>
+          </w:p>
+        </w:tc>
+        <w:tc>
+          <w:tcPr/>
+          <w:p>
+            <w:pPr>
+              <w:pStyle w:val="Compact"/>
+            </w:pPr>
+            <w:r>
+              <w:t xml:space="preserve">2 con sospecha de fuga</w:t>
             </w:r>
           </w:p>
         </w:tc>
@@ -1497,28 +1497,61 @@
               <w:jc w:val="right"/>
             </w:pPr>
             <w:r>
-              <w:t xml:space="preserve">88</w:t>
-            </w:r>
-          </w:p>
-        </w:tc>
-        <w:tc>
-          <w:tcPr/>
-          <w:p>
-            <w:pPr>
-              <w:pStyle w:val="Compact"/>
-            </w:pPr>
-          </w:p>
-        </w:tc>
-      </w:tr>
-      <w:tr>
-        <w:tc>
-          <w:tcPr/>
-          <w:p>
-            <w:pPr>
-              <w:pStyle w:val="Compact"/>
-            </w:pPr>
-            <w:r>
-              <w:t xml:space="preserve">Selección por gain y sentido económico</w:t>
+              <w:t xml:space="preserve">141</w:t>
+            </w:r>
+          </w:p>
+        </w:tc>
+        <w:tc>
+          <w:tcPr/>
+          <w:p>
+            <w:pPr>
+              <w:pStyle w:val="Compact"/>
+            </w:pPr>
+          </w:p>
+        </w:tc>
+      </w:tr>
+      <w:tr>
+        <w:tc>
+          <w:tcPr/>
+          <w:p>
+            <w:pPr>
+              <w:pStyle w:val="Compact"/>
+            </w:pPr>
+            <w:r>
+              <w:t xml:space="preserve">Ranking automatizado (U-08)</w:t>
+            </w:r>
+          </w:p>
+        </w:tc>
+        <w:tc>
+          <w:tcPr/>
+          <w:p>
+            <w:pPr>
+              <w:pStyle w:val="Compact"/>
+              <w:jc w:val="right"/>
+            </w:pPr>
+            <w:r>
+              <w:t xml:space="preserve">100</w:t>
+            </w:r>
+          </w:p>
+        </w:tc>
+        <w:tc>
+          <w:tcPr/>
+          <w:p>
+            <w:pPr>
+              <w:pStyle w:val="Compact"/>
+            </w:pPr>
+          </w:p>
+        </w:tc>
+      </w:tr>
+      <w:tr>
+        <w:tc>
+          <w:tcPr/>
+          <w:p>
+            <w:pPr>
+              <w:pStyle w:val="Compact"/>
+            </w:pPr>
+            <w:r>
+              <w:t xml:space="preserve">Selección paso a paso y sentido económico</w:t>
             </w:r>
           </w:p>
         </w:tc>
@@ -1540,6 +1573,9 @@
             <w:pPr>
               <w:pStyle w:val="Compact"/>
             </w:pPr>
+            <w:r>
+              <w:t xml:space="preserve">Se preservan los bloques sociodemográfico y financiero</w:t>
+            </w:r>
           </w:p>
         </w:tc>
       </w:tr>
@@ -1949,7 +1985,7 @@
     </w:tbl>
     <w:bookmarkEnd w:id="19"/>
     <w:bookmarkEnd w:id="20"/>
-    <w:bookmarkStart w:id="21" w:name="metodología"/>
+    <w:bookmarkStart w:id="22" w:name="metodología"/>
     <w:p>
       <w:pPr>
         <w:pStyle w:val="Heading1"/>
@@ -2204,8 +2240,769 @@
         <w:t xml:space="preserve">= 0.7.</w:t>
       </w:r>
     </w:p>
+    <w:bookmarkStart w:id="21" w:name="torneo-de-modelos"/>
+    <w:p>
+      <w:pPr>
+        <w:pStyle w:val="Heading2"/>
+      </w:pPr>
+      <w:r>
+        <w:t xml:space="preserve">Torneo de modelos</w:t>
+      </w:r>
+    </w:p>
+    <w:tbl>
+      <w:tblPr>
+        <w:tblStyle w:val="Table"/>
+        <w:tblW w:type="pct" w:w="5000"/>
+        <w:tblLayout w:type="fixed"/>
+        <w:tblLook w:firstRow="1" w:lastRow="0" w:firstColumn="0" w:lastColumn="0" w:noHBand="0" w:noVBand="0" w:val="0020"/>
+      </w:tblPr>
+      <w:tblGrid>
+        <w:gridCol w:w="2028"/>
+        <w:gridCol w:w="579"/>
+        <w:gridCol w:w="579"/>
+        <w:gridCol w:w="579"/>
+        <w:gridCol w:w="579"/>
+        <w:gridCol w:w="579"/>
+        <w:gridCol w:w="579"/>
+        <w:gridCol w:w="676"/>
+        <w:gridCol w:w="579"/>
+        <w:gridCol w:w="1159"/>
+      </w:tblGrid>
+      <w:tr>
+        <w:trPr>
+          <w:tblHeader w:val="on"/>
+        </w:trPr>
+        <w:tc>
+          <w:tcPr/>
+          <w:p>
+            <w:pPr>
+              <w:pStyle w:val="Compact"/>
+            </w:pPr>
+            <w:r>
+              <w:t xml:space="preserve">Algoritmo</w:t>
+            </w:r>
+          </w:p>
+        </w:tc>
+        <w:tc>
+          <w:tcPr/>
+          <w:p>
+            <w:pPr>
+              <w:pStyle w:val="Compact"/>
+              <w:jc w:val="right"/>
+            </w:pPr>
+            <w:r>
+              <w:t xml:space="preserve">Gini Train</w:t>
+            </w:r>
+          </w:p>
+        </w:tc>
+        <w:tc>
+          <w:tcPr/>
+          <w:p>
+            <w:pPr>
+              <w:pStyle w:val="Compact"/>
+              <w:jc w:val="right"/>
+            </w:pPr>
+            <w:r>
+              <w:t xml:space="preserve">Gini validación</w:t>
+            </w:r>
+          </w:p>
+        </w:tc>
+        <w:tc>
+          <w:tcPr/>
+          <w:p>
+            <w:pPr>
+              <w:pStyle w:val="Compact"/>
+              <w:jc w:val="right"/>
+            </w:pPr>
+            <w:r>
+              <w:t xml:space="preserve">Gini OOT</w:t>
+            </w:r>
+          </w:p>
+        </w:tc>
+        <w:tc>
+          <w:tcPr/>
+          <w:p>
+            <w:pPr>
+              <w:pStyle w:val="Compact"/>
+              <w:jc w:val="right"/>
+            </w:pPr>
+            <w:r>
+              <w:t xml:space="preserve">KS OOT</w:t>
+            </w:r>
+          </w:p>
+        </w:tc>
+        <w:tc>
+          <w:tcPr/>
+          <w:p>
+            <w:pPr>
+              <w:pStyle w:val="Compact"/>
+              <w:jc w:val="right"/>
+            </w:pPr>
+            <w:r>
+              <w:t xml:space="preserve">Brecha</w:t>
+            </w:r>
+          </w:p>
+        </w:tc>
+        <w:tc>
+          <w:tcPr/>
+          <w:p>
+            <w:pPr>
+              <w:pStyle w:val="Compact"/>
+              <w:jc w:val="right"/>
+            </w:pPr>
+            <w:r>
+              <w:t xml:space="preserve">Caída rel.</w:t>
+            </w:r>
+          </w:p>
+        </w:tc>
+        <w:tc>
+          <w:tcPr/>
+          <w:p>
+            <w:pPr>
+              <w:pStyle w:val="Compact"/>
+              <w:jc w:val="right"/>
+            </w:pPr>
+            <w:r>
+              <w:t xml:space="preserve">Brier</w:t>
+            </w:r>
+          </w:p>
+        </w:tc>
+        <w:tc>
+          <w:tcPr/>
+          <w:p>
+            <w:pPr>
+              <w:pStyle w:val="Compact"/>
+              <w:jc w:val="right"/>
+            </w:pPr>
+            <w:r>
+              <w:t xml:space="preserve">Conc. máx.</w:t>
+            </w:r>
+          </w:p>
+        </w:tc>
+        <w:tc>
+          <w:tcPr/>
+          <w:p>
+            <w:pPr>
+              <w:pStyle w:val="Compact"/>
+            </w:pPr>
+            <w:r>
+              <w:t xml:space="preserve">Estado</w:t>
+            </w:r>
+          </w:p>
+        </w:tc>
+      </w:tr>
+      <w:tr>
+        <w:tc>
+          <w:tcPr/>
+          <w:p>
+            <w:pPr>
+              <w:pStyle w:val="Compact"/>
+            </w:pPr>
+            <w:r>
+              <w:t xml:space="preserve">Regresión logística L2 (línea base)</w:t>
+            </w:r>
+          </w:p>
+        </w:tc>
+        <w:tc>
+          <w:tcPr/>
+          <w:p>
+            <w:pPr>
+              <w:pStyle w:val="Compact"/>
+              <w:jc w:val="right"/>
+            </w:pPr>
+            <w:r>
+              <w:t xml:space="preserve">50.2</w:t>
+            </w:r>
+          </w:p>
+        </w:tc>
+        <w:tc>
+          <w:tcPr/>
+          <w:p>
+            <w:pPr>
+              <w:pStyle w:val="Compact"/>
+              <w:jc w:val="right"/>
+            </w:pPr>
+            <w:r>
+              <w:t xml:space="preserve">49.6</w:t>
+            </w:r>
+          </w:p>
+        </w:tc>
+        <w:tc>
+          <w:tcPr/>
+          <w:p>
+            <w:pPr>
+              <w:pStyle w:val="Compact"/>
+              <w:jc w:val="right"/>
+            </w:pPr>
+            <w:r>
+              <w:t xml:space="preserve">49.3</w:t>
+            </w:r>
+          </w:p>
+        </w:tc>
+        <w:tc>
+          <w:tcPr/>
+          <w:p>
+            <w:pPr>
+              <w:pStyle w:val="Compact"/>
+              <w:jc w:val="right"/>
+            </w:pPr>
+            <w:r>
+              <w:t xml:space="preserve">36.0</w:t>
+            </w:r>
+          </w:p>
+        </w:tc>
+        <w:tc>
+          <w:tcPr/>
+          <w:p>
+            <w:pPr>
+              <w:pStyle w:val="Compact"/>
+              <w:jc w:val="right"/>
+            </w:pPr>
+            <w:r>
+              <w:t xml:space="preserve">0.9</w:t>
+            </w:r>
+          </w:p>
+        </w:tc>
+        <w:tc>
+          <w:tcPr/>
+          <w:p>
+            <w:pPr>
+              <w:pStyle w:val="Compact"/>
+              <w:jc w:val="right"/>
+            </w:pPr>
+            <w:r>
+              <w:t xml:space="preserve">1.8 %</w:t>
+            </w:r>
+          </w:p>
+        </w:tc>
+        <w:tc>
+          <w:tcPr/>
+          <w:p>
+            <w:pPr>
+              <w:pStyle w:val="Compact"/>
+              <w:jc w:val="right"/>
+            </w:pPr>
+            <w:r>
+              <w:t xml:space="preserve">0.0645</w:t>
+            </w:r>
+          </w:p>
+        </w:tc>
+        <w:tc>
+          <w:tcPr/>
+          <w:p>
+            <w:pPr>
+              <w:pStyle w:val="Compact"/>
+              <w:jc w:val="right"/>
+            </w:pPr>
+            <w:r>
+              <w:t xml:space="preserve">22.0 %</w:t>
+            </w:r>
+          </w:p>
+        </w:tc>
+        <w:tc>
+          <w:tcPr/>
+          <w:p>
+            <w:pPr>
+              <w:pStyle w:val="Compact"/>
+            </w:pPr>
+            <w:r>
+              <w:t xml:space="preserve">Línea base</w:t>
+            </w:r>
+          </w:p>
+        </w:tc>
+      </w:tr>
+      <w:tr>
+        <w:tc>
+          <w:tcPr/>
+          <w:p>
+            <w:pPr>
+              <w:pStyle w:val="Compact"/>
+            </w:pPr>
+            <w:r>
+              <w:t xml:space="preserve">Árbol de decisión podado</w:t>
+            </w:r>
+          </w:p>
+        </w:tc>
+        <w:tc>
+          <w:tcPr/>
+          <w:p>
+            <w:pPr>
+              <w:pStyle w:val="Compact"/>
+              <w:jc w:val="right"/>
+            </w:pPr>
+            <w:r>
+              <w:t xml:space="preserve">44.8</w:t>
+            </w:r>
+          </w:p>
+        </w:tc>
+        <w:tc>
+          <w:tcPr/>
+          <w:p>
+            <w:pPr>
+              <w:pStyle w:val="Compact"/>
+              <w:jc w:val="right"/>
+            </w:pPr>
+            <w:r>
+              <w:t xml:space="preserve">43.1</w:t>
+            </w:r>
+          </w:p>
+        </w:tc>
+        <w:tc>
+          <w:tcPr/>
+          <w:p>
+            <w:pPr>
+              <w:pStyle w:val="Compact"/>
+              <w:jc w:val="right"/>
+            </w:pPr>
+            <w:r>
+              <w:t xml:space="preserve">42.5</w:t>
+            </w:r>
+          </w:p>
+        </w:tc>
+        <w:tc>
+          <w:tcPr/>
+          <w:p>
+            <w:pPr>
+              <w:pStyle w:val="Compact"/>
+              <w:jc w:val="right"/>
+            </w:pPr>
+            <w:r>
+              <w:t xml:space="preserve">31.2</w:t>
+            </w:r>
+          </w:p>
+        </w:tc>
+        <w:tc>
+          <w:tcPr/>
+          <w:p>
+            <w:pPr>
+              <w:pStyle w:val="Compact"/>
+              <w:jc w:val="right"/>
+            </w:pPr>
+            <w:r>
+              <w:t xml:space="preserve">2.3</w:t>
+            </w:r>
+          </w:p>
+        </w:tc>
+        <w:tc>
+          <w:tcPr/>
+          <w:p>
+            <w:pPr>
+              <w:pStyle w:val="Compact"/>
+              <w:jc w:val="right"/>
+            </w:pPr>
+            <w:r>
+              <w:t xml:space="preserve">5.1 %</w:t>
+            </w:r>
+          </w:p>
+        </w:tc>
+        <w:tc>
+          <w:tcPr/>
+          <w:p>
+            <w:pPr>
+              <w:pStyle w:val="Compact"/>
+              <w:jc w:val="right"/>
+            </w:pPr>
+            <w:r>
+              <w:t xml:space="preserve">0.0671</w:t>
+            </w:r>
+          </w:p>
+        </w:tc>
+        <w:tc>
+          <w:tcPr/>
+          <w:p>
+            <w:pPr>
+              <w:pStyle w:val="Compact"/>
+              <w:jc w:val="right"/>
+            </w:pPr>
+            <w:r>
+              <w:t xml:space="preserve">31.0 %</w:t>
+            </w:r>
+          </w:p>
+        </w:tc>
+        <w:tc>
+          <w:tcPr/>
+          <w:p>
+            <w:pPr>
+              <w:pStyle w:val="Compact"/>
+            </w:pPr>
+            <w:r>
+              <w:t xml:space="preserve">Conforme</w:t>
+            </w:r>
+          </w:p>
+        </w:tc>
+      </w:tr>
+      <w:tr>
+        <w:tc>
+          <w:tcPr/>
+          <w:p>
+            <w:pPr>
+              <w:pStyle w:val="Compact"/>
+            </w:pPr>
+            <w:r>
+              <w:t xml:space="preserve">Random forest</w:t>
+            </w:r>
+          </w:p>
+        </w:tc>
+        <w:tc>
+          <w:tcPr/>
+          <w:p>
+            <w:pPr>
+              <w:pStyle w:val="Compact"/>
+              <w:jc w:val="right"/>
+            </w:pPr>
+            <w:r>
+              <w:t xml:space="preserve">55.9</w:t>
+            </w:r>
+          </w:p>
+        </w:tc>
+        <w:tc>
+          <w:tcPr/>
+          <w:p>
+            <w:pPr>
+              <w:pStyle w:val="Compact"/>
+              <w:jc w:val="right"/>
+            </w:pPr>
+            <w:r>
+              <w:t xml:space="preserve">51.8</w:t>
+            </w:r>
+          </w:p>
+        </w:tc>
+        <w:tc>
+          <w:tcPr/>
+          <w:p>
+            <w:pPr>
+              <w:pStyle w:val="Compact"/>
+              <w:jc w:val="right"/>
+            </w:pPr>
+            <w:r>
+              <w:t xml:space="preserve">50.6</w:t>
+            </w:r>
+          </w:p>
+        </w:tc>
+        <w:tc>
+          <w:tcPr/>
+          <w:p>
+            <w:pPr>
+              <w:pStyle w:val="Compact"/>
+              <w:jc w:val="right"/>
+            </w:pPr>
+            <w:r>
+              <w:t xml:space="preserve">37.4</w:t>
+            </w:r>
+          </w:p>
+        </w:tc>
+        <w:tc>
+          <w:tcPr/>
+          <w:p>
+            <w:pPr>
+              <w:pStyle w:val="Compact"/>
+              <w:jc w:val="right"/>
+            </w:pPr>
+            <w:r>
+              <w:t xml:space="preserve">5.3</w:t>
+            </w:r>
+          </w:p>
+        </w:tc>
+        <w:tc>
+          <w:tcPr/>
+          <w:p>
+            <w:pPr>
+              <w:pStyle w:val="Compact"/>
+              <w:jc w:val="right"/>
+            </w:pPr>
+            <w:r>
+              <w:t xml:space="preserve">9.5 %</w:t>
+            </w:r>
+          </w:p>
+        </w:tc>
+        <w:tc>
+          <w:tcPr/>
+          <w:p>
+            <w:pPr>
+              <w:pStyle w:val="Compact"/>
+              <w:jc w:val="right"/>
+            </w:pPr>
+            <w:r>
+              <w:t xml:space="preserve">0.0638</w:t>
+            </w:r>
+          </w:p>
+        </w:tc>
+        <w:tc>
+          <w:tcPr/>
+          <w:p>
+            <w:pPr>
+              <w:pStyle w:val="Compact"/>
+              <w:jc w:val="right"/>
+            </w:pPr>
+            <w:r>
+              <w:t xml:space="preserve">27.0 %</w:t>
+            </w:r>
+          </w:p>
+        </w:tc>
+        <w:tc>
+          <w:tcPr/>
+          <w:p>
+            <w:pPr>
+              <w:pStyle w:val="Compact"/>
+            </w:pPr>
+            <w:r>
+              <w:t xml:space="preserve">Conforme</w:t>
+            </w:r>
+          </w:p>
+        </w:tc>
+      </w:tr>
+      <w:tr>
+        <w:tc>
+          <w:tcPr/>
+          <w:p>
+            <w:pPr>
+              <w:pStyle w:val="Compact"/>
+            </w:pPr>
+            <w:r>
+              <w:t xml:space="preserve">LightGBM monotónico</w:t>
+            </w:r>
+          </w:p>
+        </w:tc>
+        <w:tc>
+          <w:tcPr/>
+          <w:p>
+            <w:pPr>
+              <w:pStyle w:val="Compact"/>
+              <w:jc w:val="right"/>
+            </w:pPr>
+            <w:r>
+              <w:t xml:space="preserve">54.6</w:t>
+            </w:r>
+          </w:p>
+        </w:tc>
+        <w:tc>
+          <w:tcPr/>
+          <w:p>
+            <w:pPr>
+              <w:pStyle w:val="Compact"/>
+              <w:jc w:val="right"/>
+            </w:pPr>
+            <w:r>
+              <w:t xml:space="preserve">52.3</w:t>
+            </w:r>
+          </w:p>
+        </w:tc>
+        <w:tc>
+          <w:tcPr/>
+          <w:p>
+            <w:pPr>
+              <w:pStyle w:val="Compact"/>
+              <w:jc w:val="right"/>
+            </w:pPr>
+            <w:r>
+              <w:t xml:space="preserve">51.9</w:t>
+            </w:r>
+          </w:p>
+        </w:tc>
+        <w:tc>
+          <w:tcPr/>
+          <w:p>
+            <w:pPr>
+              <w:pStyle w:val="Compact"/>
+              <w:jc w:val="right"/>
+            </w:pPr>
+            <w:r>
+              <w:t xml:space="preserve">38.8</w:t>
+            </w:r>
+          </w:p>
+        </w:tc>
+        <w:tc>
+          <w:tcPr/>
+          <w:p>
+            <w:pPr>
+              <w:pStyle w:val="Compact"/>
+              <w:jc w:val="right"/>
+            </w:pPr>
+            <w:r>
+              <w:t xml:space="preserve">2.7</w:t>
+            </w:r>
+          </w:p>
+        </w:tc>
+        <w:tc>
+          <w:tcPr/>
+          <w:p>
+            <w:pPr>
+              <w:pStyle w:val="Compact"/>
+              <w:jc w:val="right"/>
+            </w:pPr>
+            <w:r>
+              <w:t xml:space="preserve">4.9 %</w:t>
+            </w:r>
+          </w:p>
+        </w:tc>
+        <w:tc>
+          <w:tcPr/>
+          <w:p>
+            <w:pPr>
+              <w:pStyle w:val="Compact"/>
+              <w:jc w:val="right"/>
+            </w:pPr>
+            <w:r>
+              <w:t xml:space="preserve">0.0629</w:t>
+            </w:r>
+          </w:p>
+        </w:tc>
+        <w:tc>
+          <w:tcPr/>
+          <w:p>
+            <w:pPr>
+              <w:pStyle w:val="Compact"/>
+              <w:jc w:val="right"/>
+            </w:pPr>
+            <w:r>
+              <w:t xml:space="preserve">24.0 %</w:t>
+            </w:r>
+          </w:p>
+        </w:tc>
+        <w:tc>
+          <w:tcPr/>
+          <w:p>
+            <w:pPr>
+              <w:pStyle w:val="Compact"/>
+            </w:pPr>
+            <w:r>
+              <w:t xml:space="preserve">Challenger</w:t>
+            </w:r>
+          </w:p>
+        </w:tc>
+      </w:tr>
+      <w:tr>
+        <w:tc>
+          <w:tcPr/>
+          <w:p>
+            <w:pPr>
+              <w:pStyle w:val="Compact"/>
+            </w:pPr>
+            <w:r>
+              <w:t xml:space="preserve">XGBoost regularizado monotónico</w:t>
+            </w:r>
+          </w:p>
+        </w:tc>
+        <w:tc>
+          <w:tcPr/>
+          <w:p>
+            <w:pPr>
+              <w:pStyle w:val="Compact"/>
+              <w:jc w:val="right"/>
+            </w:pPr>
+            <w:r>
+              <w:t xml:space="preserve">54.0</w:t>
+            </w:r>
+          </w:p>
+        </w:tc>
+        <w:tc>
+          <w:tcPr/>
+          <w:p>
+            <w:pPr>
+              <w:pStyle w:val="Compact"/>
+              <w:jc w:val="right"/>
+            </w:pPr>
+            <w:r>
+              <w:t xml:space="preserve">52.6</w:t>
+            </w:r>
+          </w:p>
+        </w:tc>
+        <w:tc>
+          <w:tcPr/>
+          <w:p>
+            <w:pPr>
+              <w:pStyle w:val="Compact"/>
+              <w:jc w:val="right"/>
+            </w:pPr>
+            <w:r>
+              <w:t xml:space="preserve">52.1</w:t>
+            </w:r>
+          </w:p>
+        </w:tc>
+        <w:tc>
+          <w:tcPr/>
+          <w:p>
+            <w:pPr>
+              <w:pStyle w:val="Compact"/>
+              <w:jc w:val="right"/>
+            </w:pPr>
+            <w:r>
+              <w:t xml:space="preserve">39.2</w:t>
+            </w:r>
+          </w:p>
+        </w:tc>
+        <w:tc>
+          <w:tcPr/>
+          <w:p>
+            <w:pPr>
+              <w:pStyle w:val="Compact"/>
+              <w:jc w:val="right"/>
+            </w:pPr>
+            <w:r>
+              <w:t xml:space="preserve">1.9</w:t>
+            </w:r>
+          </w:p>
+        </w:tc>
+        <w:tc>
+          <w:tcPr/>
+          <w:p>
+            <w:pPr>
+              <w:pStyle w:val="Compact"/>
+              <w:jc w:val="right"/>
+            </w:pPr>
+            <w:r>
+              <w:t xml:space="preserve">3.5 %</w:t>
+            </w:r>
+          </w:p>
+        </w:tc>
+        <w:tc>
+          <w:tcPr/>
+          <w:p>
+            <w:pPr>
+              <w:pStyle w:val="Compact"/>
+              <w:jc w:val="right"/>
+            </w:pPr>
+            <w:r>
+              <w:t xml:space="preserve">0.0627</w:t>
+            </w:r>
+          </w:p>
+        </w:tc>
+        <w:tc>
+          <w:tcPr/>
+          <w:p>
+            <w:pPr>
+              <w:pStyle w:val="Compact"/>
+              <w:jc w:val="right"/>
+            </w:pPr>
+            <w:r>
+              <w:t xml:space="preserve">21.0 %</w:t>
+            </w:r>
+          </w:p>
+        </w:tc>
+        <w:tc>
+          <w:tcPr/>
+          <w:p>
+            <w:pPr>
+              <w:pStyle w:val="Compact"/>
+            </w:pPr>
+            <w:r>
+              <w:t xml:space="preserve">Campeón</w:t>
+            </w:r>
+          </w:p>
+        </w:tc>
+      </w:tr>
+    </w:tbl>
+    <w:p>
+      <w:pPr>
+        <w:pStyle w:val="BodyText"/>
+      </w:pPr>
+      <w:r>
+        <w:t xml:space="preserve">Reglas aplicadas: descalificación por sobreajuste (U-11), concentración máxima (U-09) y parsimonia (U-42). El OOT se evaluó una sola vez, sobre los candidatos finales.</w:t>
+      </w:r>
+    </w:p>
     <w:bookmarkEnd w:id="21"/>
-    <w:bookmarkStart w:id="28" w:name="desempeño"/>
+    <w:bookmarkEnd w:id="22"/>
+    <w:bookmarkStart w:id="29" w:name="desempeño"/>
     <w:p>
       <w:pPr>
         <w:pStyle w:val="Heading1"/>
@@ -2214,7 +3011,7 @@
         <w:t xml:space="preserve">Desempeño</w:t>
       </w:r>
     </w:p>
-    <w:bookmarkStart w:id="22" w:name="discriminación-por-muestra"/>
+    <w:bookmarkStart w:id="23" w:name="discriminación-por-muestra"/>
     <w:p>
       <w:pPr>
         <w:pStyle w:val="Heading2"/>
@@ -2505,7 +3302,23 @@
         <w:t xml:space="preserve"> </w:t>
       </w:r>
       <w:r>
-        <w:t xml:space="preserve">— cumple U-11 (máximo 10 pts). El modelo vigente tiene un Gini OOT de 45.7: mejora de</w:t>
+        <w:t xml:space="preserve">y caída relativa de</w:t>
+      </w:r>
+      <w:r>
+        <w:t xml:space="preserve"> </w:t>
+      </w:r>
+      <w:r>
+        <w:rPr>
+          <w:b/>
+          <w:bCs/>
+        </w:rPr>
+        <w:t xml:space="preserve">3.5 %</w:t>
+      </w:r>
+      <w:r>
+        <w:t xml:space="preserve"> </w:t>
+      </w:r>
+      <w:r>
+        <w:t xml:space="preserve">— cumple U-11 (máximo 10 pts y 10 %). El modelo vigente tiene un Gini OOT de 45.7: mejora de</w:t>
       </w:r>
       <w:r>
         <w:t xml:space="preserve"> </w:t>
@@ -2521,8 +3334,8 @@
         <w:t xml:space="preserve">.</w:t>
       </w:r>
     </w:p>
-    <w:bookmarkEnd w:id="22"/>
-    <w:bookmarkStart w:id="26" w:name="estabilidad-mensual"/>
+    <w:bookmarkEnd w:id="23"/>
+    <w:bookmarkStart w:id="27" w:name="estabilidad-mensual"/>
     <w:p>
       <w:pPr>
         <w:pStyle w:val="Heading2"/>
@@ -2540,18 +3353,18 @@
           <wp:inline>
             <wp:extent cx="5192395" cy="2435480"/>
             <wp:effectExtent b="0" l="0" r="0" t="0"/>
-            <wp:docPr descr="Gini por mes del periodo de construcción y del mes OOT, frente al de entrenamiento" title="" id="24" name="Picture"/>
+            <wp:docPr descr="Gini por mes del periodo de construcción y del mes OOT, frente al de entrenamiento" title="" id="25" name="Picture"/>
             <a:graphic>
               <a:graphicData uri="http://schemas.openxmlformats.org/drawingml/2006/picture">
                 <pic:pic>
                   <pic:nvPicPr>
-                    <pic:cNvPr descr="grafico-gini.png" id="25" name="Picture"/>
+                    <pic:cNvPr descr="grafico-gini.png" id="26" name="Picture"/>
                     <pic:cNvPicPr>
                       <a:picLocks noChangeArrowheads="1" noChangeAspect="1"/>
                     </pic:cNvPicPr>
                   </pic:nvPicPr>
                   <pic:blipFill>
-                    <a:blip r:embed="rId23"/>
+                    <a:blip r:embed="rId24"/>
                     <a:stretch>
                       <a:fillRect/>
                     </a:stretch>
@@ -2586,8 +3399,8 @@
         <w:t xml:space="preserve">Gini por mes del periodo de construcción y del mes OOT, frente al de entrenamiento</w:t>
       </w:r>
     </w:p>
-    <w:bookmarkEnd w:id="26"/>
-    <w:bookmarkStart w:id="27" w:name="calibración"/>
+    <w:bookmarkEnd w:id="27"/>
+    <w:bookmarkStart w:id="28" w:name="calibración"/>
     <w:p>
       <w:pPr>
         <w:pStyle w:val="Heading2"/>
@@ -3040,9 +3853,9 @@
         </w:tc>
       </w:tr>
     </w:tbl>
-    <w:bookmarkEnd w:id="27"/>
     <w:bookmarkEnd w:id="28"/>
-    <w:bookmarkStart w:id="29" w:name="interpretabilidad-sensibilidad-y-equidad"/>
+    <w:bookmarkEnd w:id="29"/>
+    <w:bookmarkStart w:id="30" w:name="interpretabilidad-sensibilidad-y-equidad"/>
     <w:p>
       <w:pPr>
         <w:pStyle w:val="Heading1"/>
@@ -3105,8 +3918,8 @@
         <w:t xml:space="preserve">No se usan atributos protegidos. La edad se probó como proxy: el AUC para predecirla con las variables del modelo es 0.58. Las tasas de verdaderos positivos por rango de edad difieren en menos de 3 pp.</w:t>
       </w:r>
     </w:p>
-    <w:bookmarkEnd w:id="29"/>
-    <w:bookmarkStart w:id="30" w:name="integración-a-la-gestión"/>
+    <w:bookmarkEnd w:id="30"/>
+    <w:bookmarkStart w:id="31" w:name="integración-a-la-gestión"/>
     <w:p>
       <w:pPr>
         <w:pStyle w:val="Heading1"/>
@@ -3277,8 +4090,8 @@
         <w:t xml:space="preserve">Solo jefaturas de agencia, con motivo de una lista cerrada, hasta 3 % de las decisiones (U-36).</w:t>
       </w:r>
     </w:p>
-    <w:bookmarkEnd w:id="30"/>
-    <w:bookmarkStart w:id="31" w:name="limitaciones"/>
+    <w:bookmarkEnd w:id="31"/>
+    <w:bookmarkStart w:id="32" w:name="limitaciones"/>
     <w:p>
       <w:pPr>
         <w:pStyle w:val="Heading1"/>
@@ -3311,8 +4124,8 @@
         <w:t xml:space="preserve">El desempeño en el canal digital es 3 pts de Gini menor y se monitoreará por separado.</w:t>
       </w:r>
     </w:p>
-    <w:bookmarkEnd w:id="31"/>
-    <w:bookmarkStart w:id="32" w:name="seguimiento"/>
+    <w:bookmarkEnd w:id="32"/>
+    <w:bookmarkStart w:id="33" w:name="seguimiento"/>
     <w:p>
       <w:pPr>
         <w:pStyle w:val="Heading1"/>
@@ -3329,8 +4142,8 @@
         <w:t xml:space="preserve">Seguimiento mensual de PSI y forzajes; discriminación y calibración trimestral con cosechas maduras (SEG-S1).</w:t>
       </w:r>
     </w:p>
-    <w:bookmarkEnd w:id="32"/>
-    <w:bookmarkStart w:id="35" w:name="cumplimiento-del-estándar"/>
+    <w:bookmarkEnd w:id="33"/>
+    <w:bookmarkStart w:id="36" w:name="cumplimiento-del-estándar"/>
     <w:p>
       <w:pPr>
         <w:pStyle w:val="Heading1"/>
@@ -3339,7 +4152,7 @@
         <w:t xml:space="preserve">Cumplimiento del estándar</w:t>
       </w:r>
     </w:p>
-    <w:bookmarkStart w:id="33" w:name="umbrales"/>
+    <w:bookmarkStart w:id="34" w:name="umbrales"/>
     <w:p>
       <w:pPr>
         <w:pStyle w:val="Heading2"/>
@@ -3679,41 +4492,41 @@
               <w:pStyle w:val="Compact"/>
             </w:pPr>
             <w:r>
-              <w:t xml:space="preserve">U-10</w:t>
-            </w:r>
-          </w:p>
-        </w:tc>
-        <w:tc>
-          <w:tcPr/>
-          <w:p>
-            <w:pPr>
-              <w:pStyle w:val="Compact"/>
-            </w:pPr>
-            <w:r>
-              <w:t xml:space="preserve">Optimización de hiperparámetros</w:t>
-            </w:r>
-          </w:p>
-        </w:tc>
-        <w:tc>
-          <w:tcPr/>
-          <w:p>
-            <w:pPr>
-              <w:pStyle w:val="Compact"/>
-              <w:jc w:val="right"/>
-            </w:pPr>
-            <w:r>
-              <w:t xml:space="preserve">60</w:t>
-            </w:r>
-          </w:p>
-        </w:tc>
-        <w:tc>
-          <w:tcPr/>
-          <w:p>
-            <w:pPr>
-              <w:pStyle w:val="Compact"/>
-            </w:pPr>
-            <w:r>
-              <w:t xml:space="preserve">Combinaciones de hiperparámetros probadas ≥ 50</w:t>
+              <w:t xml:space="preserve">U-09</w:t>
+            </w:r>
+          </w:p>
+        </w:tc>
+        <w:tc>
+          <w:tcPr/>
+          <w:p>
+            <w:pPr>
+              <w:pStyle w:val="Compact"/>
+            </w:pPr>
+            <w:r>
+              <w:t xml:space="preserve">Concentración de importancia de variables</w:t>
+            </w:r>
+          </w:p>
+        </w:tc>
+        <w:tc>
+          <w:tcPr/>
+          <w:p>
+            <w:pPr>
+              <w:pStyle w:val="Compact"/>
+              <w:jc w:val="right"/>
+            </w:pPr>
+            <w:r>
+              <w:t xml:space="preserve">0.21</w:t>
+            </w:r>
+          </w:p>
+        </w:tc>
+        <w:tc>
+          <w:tcPr/>
+          <w:p>
+            <w:pPr>
+              <w:pStyle w:val="Compact"/>
+            </w:pPr>
+            <w:r>
+              <w:t xml:space="preserve">Concentración máxima de importancia de una variable ≤ 40 %</w:t>
             </w:r>
           </w:p>
         </w:tc>
@@ -3741,41 +4554,41 @@
               <w:pStyle w:val="Compact"/>
             </w:pPr>
             <w:r>
-              <w:t xml:space="preserve">U-11</w:t>
-            </w:r>
-          </w:p>
-        </w:tc>
-        <w:tc>
-          <w:tcPr/>
-          <w:p>
-            <w:pPr>
-              <w:pStyle w:val="Compact"/>
-            </w:pPr>
-            <w:r>
-              <w:t xml:space="preserve">Sobreajuste Train vs OOT</w:t>
-            </w:r>
-          </w:p>
-        </w:tc>
-        <w:tc>
-          <w:tcPr/>
-          <w:p>
-            <w:pPr>
-              <w:pStyle w:val="Compact"/>
-              <w:jc w:val="right"/>
-            </w:pPr>
-            <w:r>
-              <w:t xml:space="preserve">1.9</w:t>
-            </w:r>
-          </w:p>
-        </w:tc>
-        <w:tc>
-          <w:tcPr/>
-          <w:p>
-            <w:pPr>
-              <w:pStyle w:val="Compact"/>
-            </w:pPr>
-            <w:r>
-              <w:t xml:space="preserve">|Gini Train − Gini OOT| ≤ 10 pts</w:t>
+              <w:t xml:space="preserve">U-10</w:t>
+            </w:r>
+          </w:p>
+        </w:tc>
+        <w:tc>
+          <w:tcPr/>
+          <w:p>
+            <w:pPr>
+              <w:pStyle w:val="Compact"/>
+            </w:pPr>
+            <w:r>
+              <w:t xml:space="preserve">Optimización de hiperparámetros</w:t>
+            </w:r>
+          </w:p>
+        </w:tc>
+        <w:tc>
+          <w:tcPr/>
+          <w:p>
+            <w:pPr>
+              <w:pStyle w:val="Compact"/>
+              <w:jc w:val="right"/>
+            </w:pPr>
+            <w:r>
+              <w:t xml:space="preserve">60</w:t>
+            </w:r>
+          </w:p>
+        </w:tc>
+        <w:tc>
+          <w:tcPr/>
+          <w:p>
+            <w:pPr>
+              <w:pStyle w:val="Compact"/>
+            </w:pPr>
+            <w:r>
+              <w:t xml:space="preserve">Combinaciones de hiperparámetros probadas ≥ 50</w:t>
             </w:r>
           </w:p>
         </w:tc>
@@ -3803,41 +4616,41 @@
               <w:pStyle w:val="Compact"/>
             </w:pPr>
             <w:r>
-              <w:t xml:space="preserve">U-38</w:t>
-            </w:r>
-          </w:p>
-        </w:tc>
-        <w:tc>
-          <w:tcPr/>
-          <w:p>
-            <w:pPr>
-              <w:pStyle w:val="Compact"/>
-            </w:pPr>
-            <w:r>
-              <w:t xml:space="preserve">Rango de IV y sospecha de fuga</w:t>
-            </w:r>
-          </w:p>
-        </w:tc>
-        <w:tc>
-          <w:tcPr/>
-          <w:p>
-            <w:pPr>
-              <w:pStyle w:val="Compact"/>
-              <w:jc w:val="right"/>
-            </w:pPr>
-            <w:r>
-              <w:t xml:space="preserve">0.41</w:t>
-            </w:r>
-          </w:p>
-        </w:tc>
-        <w:tc>
-          <w:tcPr/>
-          <w:p>
-            <w:pPr>
-              <w:pStyle w:val="Compact"/>
-            </w:pPr>
-            <w:r>
-              <w:t xml:space="preserve">IV máximo de las variables del modelo ≤ 0.50 (salvo investigación de fuga documentada)</w:t>
+              <w:t xml:space="preserve">U-11</w:t>
+            </w:r>
+          </w:p>
+        </w:tc>
+        <w:tc>
+          <w:tcPr/>
+          <w:p>
+            <w:pPr>
+              <w:pStyle w:val="Compact"/>
+            </w:pPr>
+            <w:r>
+              <w:t xml:space="preserve">Sobreajuste Train vs OOT</w:t>
+            </w:r>
+          </w:p>
+        </w:tc>
+        <w:tc>
+          <w:tcPr/>
+          <w:p>
+            <w:pPr>
+              <w:pStyle w:val="Compact"/>
+              <w:jc w:val="right"/>
+            </w:pPr>
+            <w:r>
+              <w:t xml:space="preserve">1.9</w:t>
+            </w:r>
+          </w:p>
+        </w:tc>
+        <w:tc>
+          <w:tcPr/>
+          <w:p>
+            <w:pPr>
+              <w:pStyle w:val="Compact"/>
+            </w:pPr>
+            <w:r>
+              <w:t xml:space="preserve">|Gini Train − Gini OOT| ≤ 10 pts (y caída relativa ≤ 10 %)</w:t>
             </w:r>
           </w:p>
         </w:tc>
@@ -3865,41 +4678,41 @@
               <w:pStyle w:val="Compact"/>
             </w:pPr>
             <w:r>
-              <w:t xml:space="preserve">U-39</w:t>
-            </w:r>
-          </w:p>
-        </w:tc>
-        <w:tc>
-          <w:tcPr/>
-          <w:p>
-            <w:pPr>
-              <w:pStyle w:val="Compact"/>
-            </w:pPr>
-            <w:r>
-              <w:t xml:space="preserve">No anticipación temporal de las variables</w:t>
-            </w:r>
-          </w:p>
-        </w:tc>
-        <w:tc>
-          <w:tcPr/>
-          <w:p>
-            <w:pPr>
-              <w:pStyle w:val="Compact"/>
-              <w:jc w:val="right"/>
-            </w:pPr>
-            <w:r>
-              <w:t xml:space="preserve">0</w:t>
-            </w:r>
-          </w:p>
-        </w:tc>
-        <w:tc>
-          <w:tcPr/>
-          <w:p>
-            <w:pPr>
-              <w:pStyle w:val="Compact"/>
-            </w:pPr>
-            <w:r>
-              <w:t xml:space="preserve">Variables con información posterior a la observación = 0</w:t>
+              <w:t xml:space="preserve">U-38</w:t>
+            </w:r>
+          </w:p>
+        </w:tc>
+        <w:tc>
+          <w:tcPr/>
+          <w:p>
+            <w:pPr>
+              <w:pStyle w:val="Compact"/>
+            </w:pPr>
+            <w:r>
+              <w:t xml:space="preserve">Rango de IV y sospecha de fuga</w:t>
+            </w:r>
+          </w:p>
+        </w:tc>
+        <w:tc>
+          <w:tcPr/>
+          <w:p>
+            <w:pPr>
+              <w:pStyle w:val="Compact"/>
+              <w:jc w:val="right"/>
+            </w:pPr>
+            <w:r>
+              <w:t xml:space="preserve">0.41</w:t>
+            </w:r>
+          </w:p>
+        </w:tc>
+        <w:tc>
+          <w:tcPr/>
+          <w:p>
+            <w:pPr>
+              <w:pStyle w:val="Compact"/>
+            </w:pPr>
+            <w:r>
+              <w:t xml:space="preserve">IV máximo de las variables del modelo ≤ 0.50 (sin excepción)</w:t>
             </w:r>
           </w:p>
         </w:tc>
@@ -3927,41 +4740,41 @@
               <w:pStyle w:val="Compact"/>
             </w:pPr>
             <w:r>
-              <w:t xml:space="preserve">U-40</w:t>
-            </w:r>
-          </w:p>
-        </w:tc>
-        <w:tc>
-          <w:tcPr/>
-          <w:p>
-            <w:pPr>
-              <w:pStyle w:val="Compact"/>
-            </w:pPr>
-            <w:r>
-              <w:t xml:space="preserve">Plazo máximo de desarrollo de un modelo</w:t>
-            </w:r>
-          </w:p>
-        </w:tc>
-        <w:tc>
-          <w:tcPr/>
-          <w:p>
-            <w:pPr>
-              <w:pStyle w:val="Compact"/>
-              <w:jc w:val="right"/>
-            </w:pPr>
-            <w:r>
-              <w:t xml:space="preserve">11</w:t>
-            </w:r>
-          </w:p>
-        </w:tc>
-        <w:tc>
-          <w:tcPr/>
-          <w:p>
-            <w:pPr>
-              <w:pStyle w:val="Compact"/>
-            </w:pPr>
-            <w:r>
-              <w:t xml:space="preserve">Duración del desarrollo con 2 personas ≤ 13 semanas (con agentes de IA ≤ 15 días hábiles)</w:t>
+              <w:t xml:space="preserve">U-39</w:t>
+            </w:r>
+          </w:p>
+        </w:tc>
+        <w:tc>
+          <w:tcPr/>
+          <w:p>
+            <w:pPr>
+              <w:pStyle w:val="Compact"/>
+            </w:pPr>
+            <w:r>
+              <w:t xml:space="preserve">No anticipación temporal de las variables</w:t>
+            </w:r>
+          </w:p>
+        </w:tc>
+        <w:tc>
+          <w:tcPr/>
+          <w:p>
+            <w:pPr>
+              <w:pStyle w:val="Compact"/>
+              <w:jc w:val="right"/>
+            </w:pPr>
+            <w:r>
+              <w:t xml:space="preserve">0</w:t>
+            </w:r>
+          </w:p>
+        </w:tc>
+        <w:tc>
+          <w:tcPr/>
+          <w:p>
+            <w:pPr>
+              <w:pStyle w:val="Compact"/>
+            </w:pPr>
+            <w:r>
+              <w:t xml:space="preserve">Variables con información posterior a la observación = 0</w:t>
             </w:r>
           </w:p>
         </w:tc>
@@ -3981,9 +4794,257 @@
           </w:p>
         </w:tc>
       </w:tr>
+      <w:tr>
+        <w:tc>
+          <w:tcPr/>
+          <w:p>
+            <w:pPr>
+              <w:pStyle w:val="Compact"/>
+            </w:pPr>
+            <w:r>
+              <w:t xml:space="preserve">U-40</w:t>
+            </w:r>
+          </w:p>
+        </w:tc>
+        <w:tc>
+          <w:tcPr/>
+          <w:p>
+            <w:pPr>
+              <w:pStyle w:val="Compact"/>
+            </w:pPr>
+            <w:r>
+              <w:t xml:space="preserve">Plazo máximo de desarrollo de un modelo</w:t>
+            </w:r>
+          </w:p>
+        </w:tc>
+        <w:tc>
+          <w:tcPr/>
+          <w:p>
+            <w:pPr>
+              <w:pStyle w:val="Compact"/>
+              <w:jc w:val="right"/>
+            </w:pPr>
+            <w:r>
+              <w:t xml:space="preserve">11</w:t>
+            </w:r>
+          </w:p>
+        </w:tc>
+        <w:tc>
+          <w:tcPr/>
+          <w:p>
+            <w:pPr>
+              <w:pStyle w:val="Compact"/>
+            </w:pPr>
+            <w:r>
+              <w:t xml:space="preserve">Duración del desarrollo con 2 personas ≤ 13 semanas (con agentes de IA ≤ 15 días hábiles)</w:t>
+            </w:r>
+          </w:p>
+        </w:tc>
+        <w:tc>
+          <w:tcPr/>
+          <w:p>
+            <w:pPr>
+              <w:pStyle w:val="Compact"/>
+            </w:pPr>
+            <w:r>
+              <w:rPr>
+                <w:b/>
+                <w:bCs/>
+              </w:rPr>
+              <w:t xml:space="preserve">Cumple</w:t>
+            </w:r>
+          </w:p>
+        </w:tc>
+      </w:tr>
+      <w:tr>
+        <w:tc>
+          <w:tcPr/>
+          <w:p>
+            <w:pPr>
+              <w:pStyle w:val="Compact"/>
+            </w:pPr>
+            <w:r>
+              <w:t xml:space="preserve">U-41</w:t>
+            </w:r>
+          </w:p>
+        </w:tc>
+        <w:tc>
+          <w:tcPr/>
+          <w:p>
+            <w:pPr>
+              <w:pStyle w:val="Compact"/>
+            </w:pPr>
+            <w:r>
+              <w:t xml:space="preserve">Estabilidad de la tasa del target en la ventana</w:t>
+            </w:r>
+          </w:p>
+        </w:tc>
+        <w:tc>
+          <w:tcPr/>
+          <w:p>
+            <w:pPr>
+              <w:pStyle w:val="Compact"/>
+              <w:jc w:val="right"/>
+            </w:pPr>
+            <w:r>
+              <w:t xml:space="preserve">0.12</w:t>
+            </w:r>
+          </w:p>
+        </w:tc>
+        <w:tc>
+          <w:tcPr/>
+          <w:p>
+            <w:pPr>
+              <w:pStyle w:val="Compact"/>
+            </w:pPr>
+            <w:r>
+              <w:t xml:space="preserve">Variación relativa mensual de la tasa del target ≤ 25 %</w:t>
+            </w:r>
+          </w:p>
+        </w:tc>
+        <w:tc>
+          <w:tcPr/>
+          <w:p>
+            <w:pPr>
+              <w:pStyle w:val="Compact"/>
+            </w:pPr>
+            <w:r>
+              <w:rPr>
+                <w:b/>
+                <w:bCs/>
+              </w:rPr>
+              <w:t xml:space="preserve">Cumple</w:t>
+            </w:r>
+          </w:p>
+        </w:tc>
+      </w:tr>
+      <w:tr>
+        <w:tc>
+          <w:tcPr/>
+          <w:p>
+            <w:pPr>
+              <w:pStyle w:val="Compact"/>
+            </w:pPr>
+            <w:r>
+              <w:t xml:space="preserve">U-43</w:t>
+            </w:r>
+          </w:p>
+        </w:tc>
+        <w:tc>
+          <w:tcPr/>
+          <w:p>
+            <w:pPr>
+              <w:pStyle w:val="Compact"/>
+            </w:pPr>
+            <w:r>
+              <w:t xml:space="preserve">Torneo de modelos (champion–challenger)</w:t>
+            </w:r>
+          </w:p>
+        </w:tc>
+        <w:tc>
+          <w:tcPr/>
+          <w:p>
+            <w:pPr>
+              <w:pStyle w:val="Compact"/>
+              <w:jc w:val="right"/>
+            </w:pPr>
+            <w:r>
+              <w:t xml:space="preserve">5</w:t>
+            </w:r>
+          </w:p>
+        </w:tc>
+        <w:tc>
+          <w:tcPr/>
+          <w:p>
+            <w:pPr>
+              <w:pStyle w:val="Compact"/>
+            </w:pPr>
+            <w:r>
+              <w:t xml:space="preserve">Familias de algoritmos en el torneo ≥ 5</w:t>
+            </w:r>
+          </w:p>
+        </w:tc>
+        <w:tc>
+          <w:tcPr/>
+          <w:p>
+            <w:pPr>
+              <w:pStyle w:val="Compact"/>
+            </w:pPr>
+            <w:r>
+              <w:rPr>
+                <w:b/>
+                <w:bCs/>
+              </w:rPr>
+              <w:t xml:space="preserve">Cumple</w:t>
+            </w:r>
+          </w:p>
+        </w:tc>
+      </w:tr>
+      <w:tr>
+        <w:tc>
+          <w:tcPr/>
+          <w:p>
+            <w:pPr>
+              <w:pStyle w:val="Compact"/>
+            </w:pPr>
+            <w:r>
+              <w:t xml:space="preserve">U-44</w:t>
+            </w:r>
+          </w:p>
+        </w:tc>
+        <w:tc>
+          <w:tcPr/>
+          <w:p>
+            <w:pPr>
+              <w:pStyle w:val="Compact"/>
+            </w:pPr>
+            <w:r>
+              <w:t xml:space="preserve">Monotonicidad del desempeño por deciles</w:t>
+            </w:r>
+          </w:p>
+        </w:tc>
+        <w:tc>
+          <w:tcPr/>
+          <w:p>
+            <w:pPr>
+              <w:pStyle w:val="Compact"/>
+              <w:jc w:val="right"/>
+            </w:pPr>
+            <w:r>
+              <w:t xml:space="preserve">0</w:t>
+            </w:r>
+          </w:p>
+        </w:tc>
+        <w:tc>
+          <w:tcPr/>
+          <w:p>
+            <w:pPr>
+              <w:pStyle w:val="Compact"/>
+            </w:pPr>
+            <w:r>
+              <w:t xml:space="preserve">Inversiones de la tasa observada por decil en el OOT = 0</w:t>
+            </w:r>
+          </w:p>
+        </w:tc>
+        <w:tc>
+          <w:tcPr/>
+          <w:p>
+            <w:pPr>
+              <w:pStyle w:val="Compact"/>
+            </w:pPr>
+            <w:r>
+              <w:rPr>
+                <w:b/>
+                <w:bCs/>
+              </w:rPr>
+              <w:t xml:space="preserve">Cumple</w:t>
+            </w:r>
+          </w:p>
+        </w:tc>
+      </w:tr>
     </w:tbl>
-    <w:bookmarkEnd w:id="33"/>
-    <w:bookmarkStart w:id="34" w:name="matriz-de-requisitos"/>
+    <w:bookmarkEnd w:id="34"/>
+    <w:bookmarkStart w:id="35" w:name="matriz-de-requisitos"/>
     <w:p>
       <w:pPr>
         <w:pStyle w:val="Heading2"/>
@@ -4123,7 +5184,7 @@
               <w:jc w:val="right"/>
             </w:pPr>
             <w:r>
-              <w:t xml:space="preserve">56</w:t>
+              <w:t xml:space="preserve">57</w:t>
             </w:r>
           </w:p>
         </w:tc>
@@ -4171,7 +5232,7 @@
               <w:jc w:val="right"/>
             </w:pPr>
             <w:r>
-              <w:t xml:space="preserve">56</w:t>
+              <w:t xml:space="preserve">57</w:t>
             </w:r>
           </w:p>
         </w:tc>
@@ -4342,7 +5403,7 @@
               <w:jc w:val="right"/>
             </w:pPr>
             <w:r>
-              <w:t xml:space="preserve">78</w:t>
+              <w:t xml:space="preserve">85</w:t>
             </w:r>
           </w:p>
         </w:tc>
@@ -4390,7 +5451,7 @@
               <w:jc w:val="right"/>
             </w:pPr>
             <w:r>
-              <w:t xml:space="preserve">78</w:t>
+              <w:t xml:space="preserve">85</w:t>
             </w:r>
           </w:p>
         </w:tc>
@@ -4415,7 +5476,7 @@
               <w:jc w:val="right"/>
             </w:pPr>
             <w:r>
-              <w:t xml:space="preserve">9</w:t>
+              <w:t xml:space="preserve">10</w:t>
             </w:r>
           </w:p>
         </w:tc>
@@ -4463,7 +5524,7 @@
               <w:jc w:val="right"/>
             </w:pPr>
             <w:r>
-              <w:t xml:space="preserve">9</w:t>
+              <w:t xml:space="preserve">10</w:t>
             </w:r>
           </w:p>
         </w:tc>
@@ -4561,7 +5622,7 @@
               <w:jc w:val="right"/>
             </w:pPr>
             <w:r>
-              <w:t xml:space="preserve">28</w:t>
+              <w:t xml:space="preserve">29</w:t>
             </w:r>
           </w:p>
         </w:tc>
@@ -4609,7 +5670,7 @@
               <w:jc w:val="right"/>
             </w:pPr>
             <w:r>
-              <w:t xml:space="preserve">28</w:t>
+              <w:t xml:space="preserve">29</w:t>
             </w:r>
           </w:p>
         </w:tc>
@@ -4642,7 +5703,7 @@
                 <w:b/>
                 <w:bCs/>
               </w:rPr>
-              <w:t xml:space="preserve">202</w:t>
+              <w:t xml:space="preserve">212</w:t>
             </w:r>
           </w:p>
         </w:tc>
@@ -4706,15 +5767,15 @@
                 <w:b/>
                 <w:bCs/>
               </w:rPr>
-              <w:t xml:space="preserve">202</w:t>
+              <w:t xml:space="preserve">212</w:t>
             </w:r>
           </w:p>
         </w:tc>
       </w:tr>
     </w:tbl>
-    <w:bookmarkEnd w:id="34"/>
     <w:bookmarkEnd w:id="35"/>
-    <w:bookmarkStart w:id="36" w:name="gobierno-y-aprobaciones"/>
+    <w:bookmarkEnd w:id="36"/>
+    <w:bookmarkStart w:id="37" w:name="gobierno-y-aprobaciones"/>
     <w:p>
       <w:pPr>
         <w:pStyle w:val="Heading1"/>
@@ -4886,8 +5947,8 @@
         <w:t xml:space="preserve">El modelo no se usa sin la aprobación previa del comité de riesgos de modelo (GOB-G3-01.01.01).</w:t>
       </w:r>
     </w:p>
-    <w:bookmarkEnd w:id="36"/>
-    <w:bookmarkStart w:id="37" w:name="referencias"/>
+    <w:bookmarkEnd w:id="37"/>
+    <w:bookmarkStart w:id="38" w:name="referencias"/>
     <w:p>
       <w:pPr>
         <w:pStyle w:val="Heading1"/>
@@ -4980,7 +6041,32 @@
         <w:t xml:space="preserve">(Resolución SBS n.º 00053-2023).</w:t>
       </w:r>
     </w:p>
-    <w:bookmarkEnd w:id="37"/>
+    <w:p>
+      <w:pPr>
+        <w:pStyle w:val="Compact"/>
+        <w:numPr>
+          <w:ilvl w:val="0"/>
+          <w:numId w:val="1003"/>
+        </w:numPr>
+      </w:pPr>
+      <w:r>
+        <w:t xml:space="preserve">Breiman, L. (2001). Random Forests.</w:t>
+      </w:r>
+      <w:r>
+        <w:t xml:space="preserve"> </w:t>
+      </w:r>
+      <w:r>
+        <w:rPr>
+          <w:i/>
+          <w:iCs/>
+        </w:rPr>
+        <w:t xml:space="preserve">Machine Learning</w:t>
+      </w:r>
+      <w:r>
+        <w:t xml:space="preserve">, 45(1), 5–32.</w:t>
+      </w:r>
+    </w:p>
+    <w:bookmarkEnd w:id="38"/>
     <w:sectPr>
       <w:headerReference r:id="rIdHdr1" w:type="default"/>
       <w:footerReference r:id="rIdFtr1" w:type="default"/>

</xml_diff>

<commit_message>
v5.0.0: U-11 cumple con ≤ 5 pts o caída relativa ≤ 10 %
- U-11: un candidato cumple si la diferencia de Gini Train–OOT es de 5 pts
  como máximo o si la caída relativa es de 10 % como máximo; si no cumple
  ninguna, queda descalificado sin excepción. Documento metodológico,
  gráfico de estabilidad y verificar.py aplican la regla.
- Corrige un reemplazo de 4.0.0 que sobrescribió DES-D4-14.01.01 y dejó
  sin actualizar DES-D4-05.02.06 y DES-D4-06.03.02.

Co-Authored-By: Claude Opus 5.5 <noreply@anthropic.com>
</commit_message>
<xml_diff>
--- a/ejemplos/documento-metodologico/MOD-EJEMPLO-001_documento-metodologico_v1.0.docx
+++ b/ejemplos/documento-metodologico/MOD-EJEMPLO-001_documento-metodologico_v1.0.docx
@@ -254,7 +254,7 @@
               <w:pStyle w:val="Compact"/>
             </w:pPr>
             <w:r>
-              <w:t xml:space="preserve">Estándares de Modelos en Banca v4.0.0</w:t>
+              <w:t xml:space="preserve">Estándares de Modelos en Banca v5.0.0</w:t>
             </w:r>
           </w:p>
         </w:tc>
@@ -3318,7 +3318,7 @@
         <w:t xml:space="preserve"> </w:t>
       </w:r>
       <w:r>
-        <w:t xml:space="preserve">— cumple U-11 (máximo 10 pts y 10 %). El modelo vigente tiene un Gini OOT de 45.7: mejora de</w:t>
+        <w:t xml:space="preserve">— cumple U-11 (máximo 5 pts o 10 % de caída relativa). El modelo vigente tiene un Gini OOT de 45.7: mejora de</w:t>
       </w:r>
       <w:r>
         <w:t xml:space="preserve"> </w:t>
@@ -4650,7 +4650,7 @@
               <w:pStyle w:val="Compact"/>
             </w:pPr>
             <w:r>
-              <w:t xml:space="preserve">|Gini Train − Gini OOT| ≤ 10 pts (y caída relativa ≤ 10 %)</w:t>
+              <w:t xml:space="preserve">|Gini Train − Gini OOT| ≤ 5 pts o caída relativa ≤ 10 % (caída relativa: 3.5 %)</w:t>
             </w:r>
           </w:p>
         </w:tc>

</xml_diff>